<commit_message>
docs: Update final roman numbered page reporting format
</commit_message>
<xml_diff>
--- a/report/insightswarm_roman_numered_pages.docx
+++ b/report/insightswarm_roman_numered_pages.docx
@@ -38,126 +38,83 @@
     </w:p>
     <w:p>
       <w:pPr>
+        <w:spacing w:before="100" w:after="100"/>
+      </w:pPr>
+    </w:p>
+    <w:p>
+      <w:pPr>
         <w:pStyle w:val="BodyText"/>
         <w:spacing w:line="360" w:lineRule="auto"/>
         <w:ind w:left="319" w:right="584" w:firstLine="719"/>
         <w:jc w:val="both"/>
       </w:pPr>
+      <w:r>
+        <w:t xml:space="preserve">The Ethereal Merchant is an intelligent AI-powered e-commerce platform </w:t>
+      </w:r>
       <w:proofErr w:type="spellStart"/>
       <w:r>
-        <w:t>InsightSwarm</w:t>
+        <w:t>specialising</w:t>
       </w:r>
       <w:proofErr w:type="spellEnd"/>
       <w:r>
-        <w:t xml:space="preserve"> is an AI-powered, multi-agent fact-checking system designed to combat the growing epidemic of misinformation across social media, messaging platforms, and digital news channels. The system leverages adversarial debate between four specialized AI agents, real-time source verification, and a weighted consensus algorithm to produce transparent, evidence-grounded verdicts on user-submitted </w:t>
+        <w:t xml:space="preserve"> in artisan luxury goods — handcrafted ceramics, sustainable textiles, hand-blown glassware, premium leather accessories, and atelier-grade footwear. Rather than relying on keyword-based search or static category navigation, The Ethereal Merchant leverages a multi-layer AI recommendation engine, semantic product discovery, and a curated collection architecture to surface the most relevant products to each individual user based on browsing </w:t>
       </w:r>
       <w:proofErr w:type="spellStart"/>
       <w:r>
-        <w:t>claims.The</w:t>
+        <w:t>behaviour</w:t>
       </w:r>
       <w:proofErr w:type="spellEnd"/>
       <w:r>
-        <w:t xml:space="preserve"> system deploys four agents orchestrated through </w:t>
+        <w:t>, purchase history, and preference signals.</w:t>
+      </w:r>
+    </w:p>
+    <w:p>
+      <w:pPr>
+        <w:pStyle w:val="BodyText"/>
+        <w:spacing w:line="360" w:lineRule="auto"/>
+        <w:ind w:left="319" w:right="584" w:firstLine="719"/>
+        <w:jc w:val="both"/>
+      </w:pPr>
+      <w:r>
+        <w:t xml:space="preserve">The critical differentiator of The Ethereal Merchant is its sustainability-first commerce model — every product listing includes sustainability metadata (carbon-neutral delivery eligibility, recycled packaging, eco-sourced materials), every order qualifies for carbon-neutral global delivery through the Atelier Standard, and the platform surfaces eco-choice badges and availability signals (HIGH DEMAND, ONLY 2 </w:t>
+      </w:r>
+      <w:proofErr w:type="gramStart"/>
+      <w:r>
+        <w:t>LEFT</w:t>
+      </w:r>
+      <w:proofErr w:type="gramEnd"/>
+      <w:r>
+        <w:t>, NEW, SOLD OUT) to promote mindful purchasing. Users interact with a production-ready Stitch-designed frontend deployed at stitch.withgoogle.com, featuring a curated collections browser, smart shopping bag, multi-step checkout flow, and real-time order confirmation.</w:t>
+      </w:r>
+    </w:p>
+    <w:p>
+      <w:pPr>
+        <w:pStyle w:val="BodyText"/>
+        <w:spacing w:line="360" w:lineRule="auto"/>
+        <w:ind w:left="319" w:right="584" w:firstLine="719"/>
+        <w:jc w:val="both"/>
+      </w:pPr>
+      <w:r>
+        <w:t xml:space="preserve">The backend recommendation engine employs collaborative filtering (ALS/SVD matrix </w:t>
       </w:r>
       <w:proofErr w:type="spellStart"/>
       <w:r>
-        <w:t>LangGraph</w:t>
+        <w:t>factorisation</w:t>
       </w:r>
       <w:proofErr w:type="spellEnd"/>
       <w:r>
-        <w:t xml:space="preserve">: a </w:t>
+        <w:t>) combined with content-based embedding models (Sentence-Transformers) to produce a hybrid ranking score. Inventory signal injection delivers real-time badges at sub-60-second polling intervals. A three-phase checkout pipeline (Shipping → Payment → Review) is orchestrated as a linear state machine with field validation gates, Atelier Encrypted Processing (Stripe v3+), and persistent session state for seamless back-navigation.</w:t>
       </w:r>
-      <w:proofErr w:type="spellStart"/>
+    </w:p>
+    <w:p>
+      <w:pPr>
+        <w:pStyle w:val="BodyText"/>
+        <w:spacing w:line="360" w:lineRule="auto"/>
+        <w:ind w:left="319" w:right="584" w:firstLine="719"/>
+        <w:jc w:val="both"/>
+      </w:pPr>
       <w:r>
-        <w:t>ProAgent</w:t>
-      </w:r>
-      <w:proofErr w:type="spellEnd"/>
-      <w:r>
-        <w:t xml:space="preserve"> that constructs the strongest possible case in support of a claim, a </w:t>
-      </w:r>
-      <w:proofErr w:type="spellStart"/>
-      <w:r>
-        <w:t>ConAgent</w:t>
-      </w:r>
-      <w:proofErr w:type="spellEnd"/>
-      <w:r>
-        <w:t xml:space="preserve"> that systematically challenges that case, a </w:t>
-      </w:r>
-      <w:proofErr w:type="spellStart"/>
-      <w:r>
-        <w:t>FactChecker</w:t>
-      </w:r>
-      <w:proofErr w:type="spellEnd"/>
-      <w:r>
-        <w:t xml:space="preserve"> agent that fetches and verifies every cited URL using </w:t>
-      </w:r>
-      <w:proofErr w:type="spellStart"/>
-      <w:r>
-        <w:t>BeautifulSoup</w:t>
-      </w:r>
-      <w:proofErr w:type="spellEnd"/>
-      <w:r>
-        <w:t xml:space="preserve"> and fuzzy string matching, and a Moderator agent that synthesizes the debate transcript and verification results into a final verdict with confidence score. The adversarial design ensures no single AI perspective dominates, while the verification layer eliminates hallucinated or fabricated sources — a critical failure mode in modern large language </w:t>
-      </w:r>
-      <w:proofErr w:type="spellStart"/>
-      <w:proofErr w:type="gramStart"/>
-      <w:r>
-        <w:t>models.The</w:t>
-      </w:r>
-      <w:proofErr w:type="spellEnd"/>
-      <w:proofErr w:type="gramEnd"/>
-      <w:r>
-        <w:t xml:space="preserve"> backend is powered by </w:t>
-      </w:r>
-      <w:proofErr w:type="spellStart"/>
-      <w:r>
-        <w:t>Groq's</w:t>
-      </w:r>
-      <w:proofErr w:type="spellEnd"/>
-      <w:r>
-        <w:t xml:space="preserve"> Llama 3.1 70B as the primary inference engine, with Google Gemini 2.0 Flash as an automatic fallback. This dual-provider architecture ensures near-zero downtime at zero infrastructure cost. The web interface, built on </w:t>
-      </w:r>
-      <w:proofErr w:type="spellStart"/>
-      <w:r>
-        <w:t>Streamlit</w:t>
-      </w:r>
-      <w:proofErr w:type="spellEnd"/>
-      <w:r>
-        <w:t xml:space="preserve"> and deployed to </w:t>
-      </w:r>
-      <w:proofErr w:type="spellStart"/>
-      <w:r>
-        <w:t>Streamlit</w:t>
-      </w:r>
-      <w:proofErr w:type="spellEnd"/>
-      <w:r>
-        <w:t xml:space="preserve"> Cloud, provides real-time debate progress, per-source verification status, semantic caching, and a Moderator Decision Chat for follow-up </w:t>
-      </w:r>
-      <w:proofErr w:type="spellStart"/>
-      <w:proofErr w:type="gramStart"/>
-      <w:r>
-        <w:t>reasoning.Comprehensive</w:t>
-      </w:r>
-      <w:proofErr w:type="spellEnd"/>
-      <w:proofErr w:type="gramEnd"/>
-      <w:r>
-        <w:t xml:space="preserve"> testing across 38 test cases confirms 100% pass rates. The system achieves approximately 78% verdict accuracy against professional fact-checker ground truth, reduces LLM hallucination rates from 23% to under 2%, and processes claims in under 60 seconds. </w:t>
-      </w:r>
-      <w:proofErr w:type="spellStart"/>
-      <w:r>
-        <w:t>InsightSwarm</w:t>
-      </w:r>
-      <w:proofErr w:type="spellEnd"/>
-      <w:r>
-        <w:t xml:space="preserve"> is production-deployed at </w:t>
-      </w:r>
-      <w:proofErr w:type="spellStart"/>
-      <w:r>
-        <w:t>insightswarm.streamlit.app</w:t>
-      </w:r>
-      <w:proofErr w:type="spellEnd"/>
-      <w:r>
-        <w:t xml:space="preserve"> and represents a scientifically grounded, zero-cost, open-source approach to combating AI-generated misinformation.</w:t>
+        <w:t>Comprehensive testing across all functional categories confirms 100% pass rates covering UI component rendering, cart calculation logic, checkout form validation, and recommendation engine output. The platform is production-deployed with CDN-backed asset delivery, lazy-loaded product imagery, and sub-2-second page load targets. The Ethereal Merchant demonstrates that luxury retail can operate sustainably at zero compromise to experience quality, delivering a scientifically grounded, aesthetically exceptional e-commerce system that elevates artisan commerce and empowers consumers with actionable sustainability insights</w:t>
       </w:r>
     </w:p>
     <w:p>

</xml_diff>

<commit_message>
docs(reports): Update cover and front-matter reports
</commit_message>
<xml_diff>
--- a/report/insightswarm_roman_numered_pages.docx
+++ b/report/insightswarm_roman_numered_pages.docx
@@ -48,24 +48,16 @@
         <w:ind w:left="319" w:right="584" w:firstLine="719"/>
         <w:jc w:val="both"/>
       </w:pPr>
-      <w:r>
-        <w:t xml:space="preserve">The Ethereal Merchant is an intelligent AI-powered e-commerce platform </w:t>
-      </w:r>
       <w:proofErr w:type="spellStart"/>
       <w:r>
-        <w:t>specialising</w:t>
+        <w:t>I</w:t>
+      </w:r>
+      <w:r>
+        <w:t>nsightSwarm</w:t>
       </w:r>
       <w:proofErr w:type="spellEnd"/>
       <w:r>
-        <w:t xml:space="preserve"> in artisan luxury goods — handcrafted ceramics, sustainable textiles, hand-blown glassware, premium leather accessories, and atelier-grade footwear. Rather than relying on keyword-based search or static category navigation, The Ethereal Merchant leverages a multi-layer AI recommendation engine, semantic product discovery, and a curated collection architecture to surface the most relevant products to each individual user based on browsing </w:t>
-      </w:r>
-      <w:proofErr w:type="spellStart"/>
-      <w:r>
-        <w:t>behaviour</w:t>
-      </w:r>
-      <w:proofErr w:type="spellEnd"/>
-      <w:r>
-        <w:t>, purchase history, and preference signals.</w:t>
+        <w:t xml:space="preserve"> is an AI-powered, multi-agent fact-checking system designed to combat the growing epidemic of misinformation across social media, messaging platforms, and digital news channels. The system leverages adversarial debate between four specialized AI agents, real-time source verification, and a weighted consensus algorithm to produce transparent, evidence-grounded verdicts on user-submitted claims.</w:t>
       </w:r>
     </w:p>
     <w:p>
@@ -76,15 +68,106 @@
         <w:jc w:val="both"/>
       </w:pPr>
       <w:r>
-        <w:t xml:space="preserve">The critical differentiator of The Ethereal Merchant is its sustainability-first commerce model — every product listing includes sustainability metadata (carbon-neutral delivery eligibility, recycled packaging, eco-sourced materials), every order qualifies for carbon-neutral global delivery through the Atelier Standard, and the platform surfaces eco-choice badges and availability signals (HIGH DEMAND, ONLY 2 </w:t>
+        <w:t xml:space="preserve">The system deploys four agents orchestrated through </w:t>
       </w:r>
-      <w:proofErr w:type="gramStart"/>
+      <w:proofErr w:type="spellStart"/>
       <w:r>
-        <w:t>LEFT</w:t>
+        <w:t>LangGraph</w:t>
       </w:r>
-      <w:proofErr w:type="gramEnd"/>
+      <w:proofErr w:type="spellEnd"/>
       <w:r>
-        <w:t>, NEW, SOLD OUT) to promote mindful purchasing. Users interact with a production-ready Stitch-designed frontend deployed at stitch.withgoogle.com, featuring a curated collections browser, smart shopping bag, multi-step checkout flow, and real-time order confirmation.</w:t>
+        <w:t>: a </w:t>
+      </w:r>
+      <w:proofErr w:type="spellStart"/>
+      <w:r>
+        <w:t>ProAgent</w:t>
+      </w:r>
+      <w:proofErr w:type="spellEnd"/>
+      <w:r>
+        <w:t> that constructs the strongest possible case in support of a claim, a </w:t>
+      </w:r>
+      <w:proofErr w:type="spellStart"/>
+      <w:r>
+        <w:t>ConAgent</w:t>
+      </w:r>
+      <w:proofErr w:type="spellEnd"/>
+      <w:r>
+        <w:t> that systematically challenges that case, a </w:t>
+      </w:r>
+      <w:proofErr w:type="spellStart"/>
+      <w:r>
+        <w:t>FactChecker</w:t>
+      </w:r>
+      <w:proofErr w:type="spellEnd"/>
+      <w:r>
+        <w:t xml:space="preserve"> agent that fetches and verifies every cited URL using </w:t>
+      </w:r>
+      <w:proofErr w:type="spellStart"/>
+      <w:r>
+        <w:t>BeautifulSoup</w:t>
+      </w:r>
+      <w:proofErr w:type="spellEnd"/>
+      <w:r>
+        <w:t xml:space="preserve"> and </w:t>
+      </w:r>
+      <w:proofErr w:type="spellStart"/>
+      <w:r>
+        <w:t>RapidFuzz</w:t>
+      </w:r>
+      <w:proofErr w:type="spellEnd"/>
+      <w:r>
+        <w:t xml:space="preserve"> fuzzy matching, and a Moderator agent that synthesizes the debate transcript and verification results into a final verdict with confidence score using the formula:</w:t>
+      </w:r>
+      <w:r>
+        <w:t xml:space="preserve"> </w:t>
+      </w:r>
+      <w:r>
+        <w:t>confidence = (</w:t>
+      </w:r>
+      <w:proofErr w:type="spellStart"/>
+      <w:r>
+        <w:t>arg_quality</w:t>
+      </w:r>
+      <w:proofErr w:type="spellEnd"/>
+      <w:r>
+        <w:t xml:space="preserve"> </w:t>
+      </w:r>
+      <w:r>
+        <w:t>*</w:t>
+      </w:r>
+      <w:r>
+        <w:t xml:space="preserve"> 0.30) + (</w:t>
+      </w:r>
+      <w:proofErr w:type="spellStart"/>
+      <w:r>
+        <w:t>verification_rate</w:t>
+      </w:r>
+      <w:proofErr w:type="spellEnd"/>
+      <w:r>
+        <w:t xml:space="preserve"> </w:t>
+      </w:r>
+      <w:r>
+        <w:t>*</w:t>
+      </w:r>
+      <w:r>
+        <w:t xml:space="preserve"> 0.30) + (trust </w:t>
+      </w:r>
+      <w:r>
+        <w:t>*</w:t>
+      </w:r>
+      <w:r>
+        <w:t xml:space="preserve"> 0.20) + (</w:t>
+      </w:r>
+      <w:proofErr w:type="spellStart"/>
+      <w:r>
+        <w:t>consensus_agreement</w:t>
+      </w:r>
+      <w:proofErr w:type="spellEnd"/>
+      <w:r>
+        <w:t>*</w:t>
+      </w:r>
+      <w:r>
+        <w:t>0.20).The adversarial design ensures no single AI perspective dominates, while the verification layer eliminates hallucinated or fabricated sources — a critical failure mode in modern large language models.</w:t>
       </w:r>
     </w:p>
     <w:p>
@@ -95,15 +178,31 @@
         <w:jc w:val="both"/>
       </w:pPr>
       <w:r>
-        <w:t xml:space="preserve">The backend recommendation engine employs collaborative filtering (ALS/SVD matrix </w:t>
+        <w:t>The backend is powered by </w:t>
       </w:r>
       <w:proofErr w:type="spellStart"/>
       <w:r>
-        <w:t>factorisation</w:t>
+        <w:t>Groq's</w:t>
       </w:r>
       <w:proofErr w:type="spellEnd"/>
       <w:r>
-        <w:t>) combined with content-based embedding models (Sentence-Transformers) to produce a hybrid ranking score. Inventory signal injection delivers real-time badges at sub-60-second polling intervals. A three-phase checkout pipeline (Shipping → Payment → Review) is orchestrated as a linear state machine with field validation gates, Atelier Encrypted Processing (Stripe v3+), and persistent session state for seamless back-navigation.</w:t>
+        <w:t xml:space="preserve"> Llama 3.3 70B as the primary inference engine, with Google Gemini 2.5 Flash, Cerebras, and </w:t>
+      </w:r>
+      <w:proofErr w:type="spellStart"/>
+      <w:r>
+        <w:t>OpenRouter</w:t>
+      </w:r>
+      <w:proofErr w:type="spellEnd"/>
+      <w:r>
+        <w:t> as automatic fallback providers, ensuring near-zero downtime at zero infrastructure cost. The web interface, built on React 18/Vite with a </w:t>
+      </w:r>
+      <w:proofErr w:type="spellStart"/>
+      <w:r>
+        <w:t>FastAPI</w:t>
+      </w:r>
+      <w:proofErr w:type="spellEnd"/>
+      <w:r>
+        <w:t> backend, provides real-time debate progress via Server-Sent Events (SSE), per-source verification status, semantic caching (cosine similarity threshold ≥0.85), and a Moderator Decision Chat for follow-up reasoning.</w:t>
       </w:r>
     </w:p>
     <w:p>
@@ -114,16 +213,52 @@
         <w:jc w:val="both"/>
       </w:pPr>
       <w:r>
-        <w:t>Comprehensive testing across all functional categories confirms 100% pass rates covering UI component rendering, cart calculation logic, checkout form validation, and recommendation engine output. The platform is production-deployed with CDN-backed asset delivery, lazy-loaded product imagery, and sub-2-second page load targets. The Ethereal Merchant demonstrates that luxury retail can operate sustainably at zero compromise to experience quality, delivering a scientifically grounded, aesthetically exceptional e-commerce system that elevates artisan commerce and empowers consumers with actionable sustainability insights</w:t>
+        <w:t>Comprehensive testing across 222+ test cases </w:t>
       </w:r>
-    </w:p>
-    <w:p>
-      <w:pPr>
-        <w:rPr>
-          <w:sz w:val="24"/>
-          <w:szCs w:val="24"/>
-        </w:rPr>
-      </w:pPr>
+      <w:proofErr w:type="gramStart"/>
+      <w:r>
+        <w:t>confirms</w:t>
+      </w:r>
+      <w:proofErr w:type="gramEnd"/>
+      <w:r>
+        <w:t xml:space="preserve"> 100% pass rates. The system achieves approximately 78% verdict accuracy against professional fact-checker ground truth, reduces LLM hallucination rates from 23% to under 2%, and processes claims in under 60 seconds. </w:t>
+      </w:r>
+      <w:proofErr w:type="spellStart"/>
+      <w:r>
+        <w:t>InsightSwarm</w:t>
+      </w:r>
+      <w:proofErr w:type="spellEnd"/>
+      <w:r>
+        <w:t xml:space="preserve"> is production-ready (deployed locally at localhost:5173 for React and localhost:8000 for </w:t>
+      </w:r>
+      <w:proofErr w:type="spellStart"/>
+      <w:r>
+        <w:t>FastAPI</w:t>
+      </w:r>
+      <w:proofErr w:type="spellEnd"/>
+      <w:r>
+        <w:t xml:space="preserve">, or </w:t>
+      </w:r>
+      <w:proofErr w:type="spellStart"/>
+      <w:r>
+        <w:t>containerised</w:t>
+      </w:r>
+      <w:proofErr w:type="spellEnd"/>
+      <w:r>
+        <w:t>) and represents a scientifically grounded, zero-cost, open-source approach to combating AI-generated misinformation. Five novel modules — human</w:t>
+      </w:r>
+      <w:r>
+        <w:noBreakHyphen/>
+        <w:t>in</w:t>
+      </w:r>
+      <w:r>
+        <w:noBreakHyphen/>
+        <w:t>the</w:t>
+      </w:r>
+      <w:r>
+        <w:noBreakHyphen/>
+        <w:t>loop (HITL), advanced argumentation, confidence calibration, claim complexity analysis, and explainable AI (XAI) — further enhance transparency and accuracy.</w:t>
+      </w:r>
       <w:r>
         <w:br w:type="page"/>
       </w:r>
@@ -632,21 +767,21 @@
               <w:rPr>
                 <w:spacing w:val="-2"/>
               </w:rPr>
-              <w:t xml:space="preserve">Virtual Environment Activation and </w:t>
+              <w:t xml:space="preserve">Terminal commands to start the React + </w:t>
             </w:r>
             <w:proofErr w:type="spellStart"/>
             <w:r>
               <w:rPr>
                 <w:spacing w:val="-2"/>
               </w:rPr>
-              <w:t>Streamlit</w:t>
+              <w:t>FastAPI</w:t>
             </w:r>
             <w:proofErr w:type="spellEnd"/>
             <w:r>
               <w:rPr>
                 <w:spacing w:val="-2"/>
               </w:rPr>
-              <w:t xml:space="preserve"> Launch Commands</w:t>
+              <w:t xml:space="preserve"> stack</w:t>
             </w:r>
           </w:p>
         </w:tc>
@@ -710,21 +845,7 @@
               <w:rPr>
                 <w:spacing w:val="-2"/>
               </w:rPr>
-              <w:t xml:space="preserve"> </w:t>
-            </w:r>
-            <w:proofErr w:type="spellStart"/>
-            <w:r>
-              <w:rPr>
-                <w:spacing w:val="-2"/>
-              </w:rPr>
-              <w:t>Streamlit</w:t>
-            </w:r>
-            <w:proofErr w:type="spellEnd"/>
-            <w:r>
-              <w:rPr>
-                <w:spacing w:val="-2"/>
-              </w:rPr>
-              <w:t xml:space="preserve"> Landing Page</w:t>
+              <w:t xml:space="preserve"> dashboard – API health sidebar, agent roles, and claim input</w:t>
             </w:r>
           </w:p>
         </w:tc>
@@ -780,7 +901,14 @@
               <w:rPr>
                 <w:spacing w:val="-2"/>
               </w:rPr>
-              <w:t>Claim Entry and Verification Trigger — INSUFFICIENT EVIDENCE Verdict</w:t>
+              <w:t>Real</w:t>
+            </w:r>
+            <w:r>
+              <w:rPr>
+                <w:spacing w:val="-2"/>
+              </w:rPr>
+              <w:noBreakHyphen/>
+              <w:t>time pipeline progress with timing for decompose, evidence search, and debate rounds</w:t>
             </w:r>
           </w:p>
         </w:tc>
@@ -836,7 +964,7 @@
               <w:rPr>
                 <w:spacing w:val="-2"/>
               </w:rPr>
-              <w:t>Verdict Display with Confidence Score and Moderator Reasoning</w:t>
+              <w:t>Pipeline execution summary – all stages completed with final verdict score (0.33)</w:t>
             </w:r>
           </w:p>
         </w:tc>
@@ -892,7 +1020,7 @@
               <w:rPr>
                 <w:spacing w:val="-2"/>
               </w:rPr>
-              <w:t>Per-Source Verification Report — Intelligence Metrics and Source Panel</w:t>
+              <w:t>Source verification results – semantic similarity scores, Verified/Failed badges, and URL list</w:t>
             </w:r>
           </w:p>
         </w:tc>
@@ -948,7 +1076,49 @@
               <w:rPr>
                 <w:spacing w:val="-2"/>
               </w:rPr>
-              <w:t>Detailed Source Results — Per-URL Verification Status with OK / FAIL Badges</w:t>
+              <w:t>Debate transcript viewer – round</w:t>
+            </w:r>
+            <w:r>
+              <w:rPr>
+                <w:spacing w:val="-2"/>
+              </w:rPr>
+              <w:noBreakHyphen/>
+              <w:t>by</w:t>
+            </w:r>
+            <w:r>
+              <w:rPr>
+                <w:spacing w:val="-2"/>
+              </w:rPr>
+              <w:noBreakHyphen/>
+              <w:t xml:space="preserve">round </w:t>
+            </w:r>
+            <w:proofErr w:type="spellStart"/>
+            <w:r>
+              <w:rPr>
+                <w:spacing w:val="-2"/>
+              </w:rPr>
+              <w:t>ProAgent</w:t>
+            </w:r>
+            <w:proofErr w:type="spellEnd"/>
+            <w:r>
+              <w:rPr>
+                <w:spacing w:val="-2"/>
+              </w:rPr>
+              <w:t xml:space="preserve"> vs </w:t>
+            </w:r>
+            <w:proofErr w:type="spellStart"/>
+            <w:r>
+              <w:rPr>
+                <w:spacing w:val="-2"/>
+              </w:rPr>
+              <w:t>ConAgent</w:t>
+            </w:r>
+            <w:proofErr w:type="spellEnd"/>
+            <w:r>
+              <w:rPr>
+                <w:spacing w:val="-2"/>
+              </w:rPr>
+              <w:t xml:space="preserve"> arguments with pipeline checkmarks</w:t>
             </w:r>
           </w:p>
         </w:tc>
@@ -1006,7 +1176,7 @@
               <w:rPr>
                 <w:spacing w:val="-2"/>
               </w:rPr>
-              <w:t>Full Debate Transcript Viewer — Round 3 PRO vs CON with Feedback Protocol</w:t>
+              <w:t>Moderator final analysis panel showing intelligence metrics and verdict confidence</w:t>
             </w:r>
           </w:p>
         </w:tc>
@@ -1024,254 +1194,6 @@
                 <w:spacing w:val="-2"/>
               </w:rPr>
               <w:t>16</w:t>
-            </w:r>
-          </w:p>
-        </w:tc>
-      </w:tr>
-      <w:tr>
-        <w:trPr>
-          <w:trHeight w:val="621"/>
-        </w:trPr>
-        <w:tc>
-          <w:tcPr>
-            <w:tcW w:w="943" w:type="dxa"/>
-          </w:tcPr>
-          <w:p>
-            <w:pPr>
-              <w:pStyle w:val="TableParagraph"/>
-              <w:ind w:left="12"/>
-            </w:pPr>
-            <w:proofErr w:type="spellStart"/>
-            <w:r>
-              <w:rPr>
-                <w:spacing w:val="-2"/>
-              </w:rPr>
-              <w:t>Sr.No</w:t>
-            </w:r>
-            <w:proofErr w:type="spellEnd"/>
-            <w:r>
-              <w:rPr>
-                <w:spacing w:val="-2"/>
-              </w:rPr>
-              <w:t>.</w:t>
-            </w:r>
-          </w:p>
-        </w:tc>
-        <w:tc>
-          <w:tcPr>
-            <w:tcW w:w="5161" w:type="dxa"/>
-          </w:tcPr>
-          <w:p>
-            <w:pPr>
-              <w:pStyle w:val="TableParagraph"/>
-              <w:ind w:left="11" w:right="4"/>
-            </w:pPr>
-            <w:r>
-              <w:rPr>
-                <w:spacing w:val="-2"/>
-              </w:rPr>
-              <w:t>Figure Name</w:t>
-            </w:r>
-          </w:p>
-        </w:tc>
-        <w:tc>
-          <w:tcPr>
-            <w:tcW w:w="3541" w:type="dxa"/>
-          </w:tcPr>
-          <w:p>
-            <w:pPr>
-              <w:pStyle w:val="TableParagraph"/>
-              <w:ind w:left="13" w:right="1"/>
-            </w:pPr>
-            <w:r>
-              <w:rPr>
-                <w:spacing w:val="-2"/>
-              </w:rPr>
-              <w:t>Page No</w:t>
-            </w:r>
-          </w:p>
-        </w:tc>
-      </w:tr>
-      <w:tr>
-        <w:trPr>
-          <w:trHeight w:val="618"/>
-        </w:trPr>
-        <w:tc>
-          <w:tcPr>
-            <w:tcW w:w="943" w:type="dxa"/>
-          </w:tcPr>
-          <w:p>
-            <w:pPr>
-              <w:pStyle w:val="TableParagraph"/>
-              <w:ind w:left="12"/>
-            </w:pPr>
-            <w:r>
-              <w:rPr>
-                <w:spacing w:val="-2"/>
-              </w:rPr>
-              <w:t>2.1.0</w:t>
-            </w:r>
-          </w:p>
-        </w:tc>
-        <w:tc>
-          <w:tcPr>
-            <w:tcW w:w="5161" w:type="dxa"/>
-          </w:tcPr>
-          <w:p>
-            <w:pPr>
-              <w:pStyle w:val="TableParagraph"/>
-              <w:ind w:left="11" w:right="1"/>
-            </w:pPr>
-            <w:r>
-              <w:rPr>
-                <w:spacing w:val="-2"/>
-              </w:rPr>
-              <w:t>Conventional Single-AI Fact-Checking Architecture</w:t>
-            </w:r>
-          </w:p>
-        </w:tc>
-        <w:tc>
-          <w:tcPr>
-            <w:tcW w:w="3541" w:type="dxa"/>
-          </w:tcPr>
-          <w:p>
-            <w:pPr>
-              <w:pStyle w:val="TableParagraph"/>
-              <w:ind w:left="13" w:right="1"/>
-            </w:pPr>
-            <w:r>
-              <w:rPr>
-                <w:spacing w:val="-2"/>
-              </w:rPr>
-              <w:t>7</w:t>
-            </w:r>
-          </w:p>
-        </w:tc>
-      </w:tr>
-      <w:tr>
-        <w:trPr>
-          <w:trHeight w:val="621"/>
-        </w:trPr>
-        <w:tc>
-          <w:tcPr>
-            <w:tcW w:w="943" w:type="dxa"/>
-          </w:tcPr>
-          <w:p>
-            <w:pPr>
-              <w:pStyle w:val="TableParagraph"/>
-              <w:ind w:left="12"/>
-            </w:pPr>
-            <w:r>
-              <w:rPr>
-                <w:spacing w:val="-2"/>
-              </w:rPr>
-              <w:t>4.1.0</w:t>
-            </w:r>
-          </w:p>
-        </w:tc>
-        <w:tc>
-          <w:tcPr>
-            <w:tcW w:w="5161" w:type="dxa"/>
-          </w:tcPr>
-          <w:p>
-            <w:pPr>
-              <w:pStyle w:val="TableParagraph"/>
-              <w:ind w:left="11" w:right="2"/>
-            </w:pPr>
-            <w:r>
-              <w:rPr>
-                <w:spacing w:val="-2"/>
-              </w:rPr>
-              <w:t xml:space="preserve">High-Level Architecture of </w:t>
-            </w:r>
-            <w:proofErr w:type="spellStart"/>
-            <w:r>
-              <w:rPr>
-                <w:spacing w:val="-2"/>
-              </w:rPr>
-              <w:t>InsightSwarm</w:t>
-            </w:r>
-            <w:proofErr w:type="spellEnd"/>
-          </w:p>
-        </w:tc>
-        <w:tc>
-          <w:tcPr>
-            <w:tcW w:w="3541" w:type="dxa"/>
-          </w:tcPr>
-          <w:p>
-            <w:pPr>
-              <w:pStyle w:val="TableParagraph"/>
-              <w:ind w:left="13" w:right="1"/>
-            </w:pPr>
-            <w:r>
-              <w:rPr>
-                <w:spacing w:val="-2"/>
-              </w:rPr>
-              <w:t>10</w:t>
-            </w:r>
-          </w:p>
-        </w:tc>
-      </w:tr>
-      <w:tr>
-        <w:trPr>
-          <w:trHeight w:val="618"/>
-        </w:trPr>
-        <w:tc>
-          <w:tcPr>
-            <w:tcW w:w="943" w:type="dxa"/>
-          </w:tcPr>
-          <w:p>
-            <w:pPr>
-              <w:pStyle w:val="TableParagraph"/>
-              <w:ind w:left="12"/>
-            </w:pPr>
-            <w:r>
-              <w:rPr>
-                <w:spacing w:val="-2"/>
-              </w:rPr>
-              <w:t>4.2.0</w:t>
-            </w:r>
-          </w:p>
-        </w:tc>
-        <w:tc>
-          <w:tcPr>
-            <w:tcW w:w="5161" w:type="dxa"/>
-          </w:tcPr>
-          <w:p>
-            <w:pPr>
-              <w:pStyle w:val="TableParagraph"/>
-              <w:ind w:left="11" w:right="4"/>
-            </w:pPr>
-            <w:proofErr w:type="spellStart"/>
-            <w:r>
-              <w:rPr>
-                <w:spacing w:val="-2"/>
-              </w:rPr>
-              <w:t>LangGraph</w:t>
-            </w:r>
-            <w:proofErr w:type="spellEnd"/>
-            <w:r>
-              <w:rPr>
-                <w:spacing w:val="-2"/>
-              </w:rPr>
-              <w:t xml:space="preserve"> State Machine — Debate Orchestration Flow</w:t>
-            </w:r>
-          </w:p>
-        </w:tc>
-        <w:tc>
-          <w:tcPr>
-            <w:tcW w:w="3541" w:type="dxa"/>
-          </w:tcPr>
-          <w:p>
-            <w:pPr>
-              <w:pStyle w:val="TableParagraph"/>
-              <w:ind w:left="13" w:right="1"/>
-            </w:pPr>
-            <w:r>
-              <w:rPr>
-                <w:spacing w:val="-2"/>
-              </w:rPr>
-              <w:t>11</w:t>
             </w:r>
           </w:p>
         </w:tc>
@@ -6639,7 +6561,6 @@
   <w:style w:type="character" w:default="1" w:styleId="DefaultParagraphFont">
     <w:name w:val="Default Paragraph Font"/>
     <w:uiPriority w:val="1"/>
-    <w:semiHidden/>
     <w:unhideWhenUsed/>
   </w:style>
   <w:style w:type="table" w:default="1" w:styleId="TableNormal">

</xml_diff>